<commit_message>
Update real Langfuse screenshots and reports for Lab 3
</commit_message>
<xml_diff>
--- a/students/ai-243/ipatov-bohdan/lab3/report.docx
+++ b/students/ai-243/ipatov-bohdan/lab3/report.docx
@@ -3784,7 +3784,7 @@
       <w:r>
         <w:drawing>
           <wp:inline xmlns:a="http://schemas.openxmlformats.org/drawingml/2006/main" xmlns:pic="http://schemas.openxmlformats.org/drawingml/2006/picture">
-            <wp:extent cx="5486400" cy="3086100"/>
+            <wp:extent cx="5486400" cy="5446311"/>
             <wp:docPr id="1" name="Picture 1"/>
             <wp:cNvGraphicFramePr>
               <a:graphicFrameLocks noChangeAspect="1"/>
@@ -3805,7 +3805,7 @@
                   <pic:spPr>
                     <a:xfrm>
                       <a:off x="0" y="0"/>
-                      <a:ext cx="5486400" cy="3086100"/>
+                      <a:ext cx="5486400" cy="5446311"/>
                     </a:xfrm>
                     <a:prstGeom prst="rect"/>
                   </pic:spPr>
@@ -3841,7 +3841,7 @@
       <w:r>
         <w:drawing>
           <wp:inline xmlns:a="http://schemas.openxmlformats.org/drawingml/2006/main" xmlns:pic="http://schemas.openxmlformats.org/drawingml/2006/picture">
-            <wp:extent cx="5486400" cy="3086100"/>
+            <wp:extent cx="5486400" cy="3826118"/>
             <wp:docPr id="2" name="Picture 2"/>
             <wp:cNvGraphicFramePr>
               <a:graphicFrameLocks noChangeAspect="1"/>
@@ -3862,7 +3862,7 @@
                   <pic:spPr>
                     <a:xfrm>
                       <a:off x="0" y="0"/>
-                      <a:ext cx="5486400" cy="3086100"/>
+                      <a:ext cx="5486400" cy="3826118"/>
                     </a:xfrm>
                     <a:prstGeom prst="rect"/>
                   </pic:spPr>

</xml_diff>